<commit_message>
Fase 1: presentacion corta y metodologia en cascada
</commit_message>
<xml_diff>
--- a/Fase 1/Evidencias Grupales/1.5_GuiaEstudiante_Fase 1_Definicion Proyecto APT.docx
+++ b/Fase 1/Evidencias Grupales/1.5_GuiaEstudiante_Fase 1_Definicion Proyecto APT.docx
@@ -1066,7 +1066,7 @@
                 <w:color w:val="000000"/>
                 <w:sz w:val="20"/>
               </w:rPr>
-              <w:t>• Gestión de proyectos informáticos (planificación por iteraciones, control de versiones y coordinación de un equipo de tres integrantes).</w:t>
+              <w:t>• Gestión de proyectos informáticos (planificación por etapas, control de versiones y coordinación de un equipo de tres integrantes).</w:t>
             </w:r>
           </w:p>
         </w:tc>
@@ -1689,7 +1689,7 @@
                 <w:color w:val="000000"/>
                 <w:sz w:val="20"/>
               </w:rPr>
-              <w:t>La construcción de modelos de datos aparece en la definición de ítems, recetas, monstruos y diálogos como recursos tipados, y en el sistema de guardado de partidas en JSON. Las pruebas se abordan con scripts automatizados que ejecutan el juego sin interfaz gráfica y verifican cada sistema. La gestión del proyecto se aplica con un tablero de tareas, iteraciones planificadas y un flujo de ramas y pull requests en GitHub para coordinar al equipo.</w:t>
+              <w:t>La construcción de modelos de datos aparece en la definición de ítems, recetas, monstruos y diálogos como recursos tipados, y en el sistema de guardado de partidas en JSON. Las pruebas se abordan con scripts automatizados que ejecutan el juego sin interfaz gráfica y verifican cada sistema. La gestión del proyecto se aplica con un tablero de tareas, etapas planificadas y un flujo de ramas y pull requests en GitHub para coordinar al equipo.</w:t>
             </w:r>
           </w:p>
         </w:tc>
@@ -1931,7 +1931,7 @@
                 <w:color w:val="000000"/>
                 <w:sz w:val="20"/>
               </w:rPr>
-              <w:t>(1) la práctica profesional en paralelo reduce el tiempo disponible, por lo que se planifica por iteraciones cortas y se prioriza lo esencial; (2) el riesgo de pérdida de trabajo, que ya ocurrió una vez, se mitiga con control de versiones en GitHub y respaldos; (3) los conflictos al integrar el trabajo de varios integrantes se reducen con ramas por funcionalidad y revisión mediante pull requests; (4) la dependencia del arte se resuelve con recursos provisionales mientras se genera el definitivo.</w:t>
+              <w:t>(1) la práctica profesional en paralelo reduce el tiempo disponible, por lo que se planifica cada etapa con holgura y se prioriza lo esencial; (2) el riesgo de pérdida de trabajo, que ya ocurrió una vez, se mitiga con control de versiones en GitHub y respaldos; (3) los conflictos al integrar el trabajo de varios integrantes se reducen con ramas por funcionalidad y revisión mediante pull requests; (4) la dependencia del arte se resuelve con recursos provisionales mientras se genera el definitivo.</w:t>
             </w:r>
           </w:p>
         </w:tc>
@@ -2670,7 +2670,7 @@
                 <w:color w:val="000000"/>
                 <w:sz w:val="20"/>
               </w:rPr>
-              <w:t>Se utilizará una metodología ágil basada en Scrum (Schwaber y Sutherland, 2020), adaptada a un equipo de tres personas. El desarrollo de videojuegos se beneficia de un enfoque iterativo, porque las mecánicas deben probarse jugándolas y ajustarse según el resultado; un modelo en cascada no permitiría ese ciclo de prueba y corrección.</w:t>
+              <w:t>Se utilizará la metodología en cascada, un modelo secuencial en el que cada etapa se completa antes de iniciar la siguiente (Sommerville, 2011). Se eligió porque el alcance del corte vertical está definido desde el inicio en el documento de diseño (GDD), lo que permite planificar el semestre por etapas, mantener un control claro del avance y alinear cada etapa con las fases de la asignatura.</w:t>
             </w:r>
           </w:p>
           <w:p>
@@ -2703,7 +2703,7 @@
                 <w:color w:val="000000"/>
                 <w:sz w:val="20"/>
               </w:rPr>
-              <w:t>(1) Análisis y diseño (Fase 1): levantamiento del alcance, redacción del GDD, definición de la arquitectura y del backlog. (2) Desarrollo iterativo (Fase 2): sprints de dos semanas; cada sprint parte con una planificación de tareas desde el backlog en Trello y termina con una versión jugable que se revisa en equipo. (3) Pruebas y cierre (Fase 3): pruebas de juego con usuarios, corrección de errores, pulido y preparación de la presentación.</w:t>
+              <w:t>(1) Planificación (Fase 1): definición del alcance, roles, tiempos y riesgos. (2) Diseño (Fase 1): mecánicas del juego, contenido didáctico de metalurgia, arquitectura y modelo de datos, documentados en el GDD. (3) Implementación (Fase 2): construcción de cada sistema según lo diseñado e integración progresiva de los módulos (forja y fichas de metales, interfaz, exploración, combate, narrativa y guardado). (4) Pruebas (Fase 2): pruebas automatizadas de cada sistema y pruebas de juego con estudiantes de metalurgia. (5) Entrega (Fase 3): corrección final, publicación en itch.io y presentación ante la comisión.</w:t>
             </w:r>
           </w:p>
           <w:p>
@@ -2736,7 +2736,7 @@
                 <w:color w:val="000000"/>
                 <w:sz w:val="20"/>
               </w:rPr>
-              <w:t>control de versiones en GitHub con una rama por funcionalidad e integración mediante pull requests; pruebas automatizadas que ejecutan el juego sin interfaz gráfica para verificar cada sistema; comunicación diaria por WhatsApp y reuniones de revisión al cierre de cada sprint.</w:t>
+              <w:t>control de versiones en GitHub con una rama por funcionalidad e integración mediante pull requests; tablero Trello con las tareas de cada etapa; comunicación diaria por WhatsApp y reuniones de revisión al cierre de cada etapa.</w:t>
             </w:r>
           </w:p>
           <w:p>
@@ -3814,7 +3814,7 @@
                 <w:color w:val="000000"/>
                 <w:sz w:val="18"/>
               </w:rPr>
-              <w:t>Repositorio en GitHub con historial de commits y pull requests, y tablero Trello con el backlog y los sprints.</w:t>
+              <w:t>Repositorio en GitHub con historial de commits y pull requests, y tablero Trello con las tareas de cada etapa.</w:t>
             </w:r>
           </w:p>
         </w:tc>
@@ -5203,7 +5203,7 @@
                 <w:color w:val="000000"/>
                 <w:sz w:val="16"/>
               </w:rPr>
-              <w:t>Crear el backlog en Trello, la carta Gantt, el repositorio y definir la arquitectura de escenas y sistemas.</w:t>
+              <w:t>Crear el tablero de tareas en Trello, la carta Gantt, el repositorio y definir la arquitectura de escenas y sistemas.</w:t>
             </w:r>
           </w:p>
         </w:tc>
@@ -13583,7 +13583,7 @@
                 <w:color w:val="000000"/>
                 <w:sz w:val="20"/>
               </w:rPr>
-              <w:t>Anvil of Ambition es un videojuego 2D de rol en pixel art, desarrollado en Godot, que apoya a estudiantes de metalurgia en el aprendizaje de los minerales y las propiedades de los metales. El jugador explora una mina, identifica minerales reales como la hematita, la calcopirita y la casiterita, los funde para separar el metal de la escoria y los trabaja en una herrería, donde observa el punto de fusión, el rango de temperatura en que cada metal es maleable y el efecto de las aleaciones. El proyecto busca transformar contenidos que hoy se enseñan desde tablas teóricas en una experiencia interactiva. Se desarrolla con una metodología ágil basada en Scrum, en un equipo de tres integrantes, y su resultado es un corte vertical jugable que será validado mediante pruebas automatizadas y pruebas con estudiantes.</w:t>
+              <w:t>Anvil of Ambition es un videojuego 2D de rol en pixel art, desarrollado en Godot, que apoya a estudiantes de metalurgia en el aprendizaje de los minerales y las propiedades de los metales. El jugador explora una mina, identifica minerales reales como la hematita, la calcopirita y la casiterita, los funde para separar el metal de la escoria y los trabaja en una herrería, donde observa el punto de fusión, el rango de temperatura en que cada metal es maleable y el efecto de las aleaciones. El proyecto busca transformar contenidos que hoy se enseñan desde tablas teóricas en una experiencia interactiva. Se desarrolla con la metodología en cascada, en un equipo de tres integrantes, y su resultado es un corte vertical jugable que será validado mediante pruebas automatizadas y pruebas con estudiantes.</w:t>
             </w:r>
           </w:p>
           <w:p>
@@ -13630,7 +13630,7 @@
                 <w:color w:val="000000"/>
                 <w:sz w:val="20"/>
               </w:rPr>
-              <w:t>Anvil of Ambition is a 2D pixel-art role-playing game developed in Godot that supports metallurgy students in learning about minerals and the properties of metals. The player explores a mine, identifies real minerals such as hematite, chalcopyrite and cassiterite, smelts them to separate the metal from the slag, and works them in a smithy, where they observe the melting point, the temperature range in which each metal is malleable, and the effect of alloys. The project aims to turn content that is currently taught through theoretical tables into an interactive experience. It is developed using an agile methodology based on Scrum by a team of three members, and its outcome is a playable vertical slice that will be validated through automated tests and testing sessions with students.</w:t>
+              <w:t>Anvil of Ambition is a 2D pixel-art role-playing game developed in Godot that supports metallurgy students in learning about minerals and the properties of metals. The player explores a mine, identifies real minerals such as hematite, chalcopyrite and cassiterite, smelts them to separate the metal from the slag, and works them in a smithy, where they observe the melting point, the temperature range in which each metal is malleable, and the effect of alloys. The project aims to turn content that is currently taught through theoretical tables into an interactive experience. It is developed using the waterfall methodology by a team of three members, and its outcome is a playable vertical slice that will be validated through automated tests and testing sessions with students.</w:t>
             </w:r>
           </w:p>
         </w:tc>
@@ -14421,7 +14421,7 @@
                 <w:color w:val="000000"/>
                 <w:sz w:val="18"/>
               </w:rPr>
-              <w:t>Schwaber, K. y Sutherland, J. (2020). La Guía de Scrum. https://scrumguides.org/</w:t>
+              <w:t>Sommerville, I. (2011). Ingeniería de software (9.ª ed.). Pearson Educación.</w:t>
             </w:r>
           </w:p>
           <w:p>

</xml_diff>